<commit_message>
starting to sum things up
</commit_message>
<xml_diff>
--- a/Subjected/Digital Art/Drawing.docx
+++ b/Subjected/Digital Art/Drawing.docx
@@ -152,6 +152,94 @@
     </w:p>
     <w:p>
       <w:pPr>
+        <w:pStyle w:val="Heading4"/>
+      </w:pPr>
+      <w:r>
+        <w:t>Interior Contour</w:t>
+      </w:r>
+    </w:p>
+    <w:p>
+      <w:r>
+        <w:t>Edges within the main general outline,</w:t>
+      </w:r>
+    </w:p>
+    <w:p>
+      <w:pPr>
+        <w:pStyle w:val="Heading4"/>
+      </w:pPr>
+      <w:r>
+        <w:t>Cross Contour</w:t>
+      </w:r>
+    </w:p>
+    <w:p>
+      <w:r>
+        <w:t>Travel from one edge to another it’s intuitive , usually not visible.</w:t>
+      </w:r>
+    </w:p>
+    <w:p>
+      <w:pPr>
+        <w:pStyle w:val="Heading3"/>
+      </w:pPr>
+      <w:r>
+        <w:t>Blind Drawing</w:t>
+      </w:r>
+    </w:p>
+    <w:p/>
+    <w:p>
+      <w:pPr>
+        <w:pStyle w:val="Heading3"/>
+      </w:pPr>
+      <w:r>
+        <w:lastRenderedPageBreak/>
+        <w:t>Contours</w:t>
+      </w:r>
+    </w:p>
+    <w:p/>
+    <w:p/>
+    <w:p/>
+    <w:p/>
+    <w:p/>
+    <w:p/>
+    <w:p/>
+    <w:p/>
+    <w:p/>
+    <w:p/>
+    <w:p/>
+    <w:p/>
+    <w:p>
+      <w:pPr>
+        <w:pStyle w:val="Heading1"/>
+      </w:pPr>
+      <w:r>
+        <w:t xml:space="preserve">Sculpting </w:t>
+      </w:r>
+    </w:p>
+    <w:p>
+      <w:r>
+        <w:t>Start with big brushes</w:t>
+      </w:r>
+      <w:r>
+        <w:t>.</w:t>
+      </w:r>
+    </w:p>
+    <w:p>
+      <w:r>
+        <w:t>(un ZBrush typically BMV is the key brush you begin with AKA move brush apparently).</w:t>
+      </w:r>
+    </w:p>
+    <w:p/>
+    <w:p>
+      <w:r>
+        <w:t>Then we tend to use something long clay build up such as bcb.</w:t>
+      </w:r>
+    </w:p>
+    <w:p/>
+    <w:p/>
+    <w:p/>
+    <w:p/>
+    <w:p/>
+    <w:p>
+      <w:pPr>
         <w:pStyle w:val="Heading1"/>
       </w:pPr>
       <w:r>
@@ -185,6 +273,16 @@
     </w:p>
     <w:p>
       <w:r>
+        <w:t>By F we can focus in on geometry.</w:t>
+      </w:r>
+    </w:p>
+    <w:p>
+      <w:r>
+        <w:t>We can separate objects using the select tool.</w:t>
+      </w:r>
+    </w:p>
+    <w:p>
+      <w:r>
         <w:t>You must be using the select tool to select objects,mesh.</w:t>
       </w:r>
       <w:r>
@@ -450,6 +548,19 @@
       </w:r>
     </w:p>
     <w:p>
+      <w:r>
+        <w:t>Clicking Shift+Enter while selecting a node leads to the new node being added with the visibility ON</w:t>
+      </w:r>
+      <w:r>
+        <w:t>.</w:t>
+      </w:r>
+    </w:p>
+    <w:p>
+      <w:r>
+        <w:t>The documentation of these notes do exist on FXs official website.(most are under the SOP tab).</w:t>
+      </w:r>
+    </w:p>
+    <w:p>
       <w:pPr>
         <w:pStyle w:val="Heading3"/>
       </w:pPr>
@@ -477,13 +588,110 @@
       <w:r>
         <w:t>Geometry Output</w:t>
       </w:r>
-    </w:p>
-    <w:p/>
+      <w:r>
+        <w:t xml:space="preserve">, used to actually </w:t>
+      </w:r>
+      <w:r>
+        <w:t>save the result.</w:t>
+      </w:r>
+    </w:p>
+    <w:p>
+      <w:pPr>
+        <w:pStyle w:val="Heading3"/>
+      </w:pPr>
+      <w:r>
+        <w:t>Matchsize</w:t>
+      </w:r>
+    </w:p>
+    <w:p>
+      <w:r>
+        <w:t>Forces a box around the input object(s)</w:t>
+      </w:r>
+      <w:r>
+        <w:t>. We could use the tick “scale to fit” to enforce the object to be within the bounds of Matchsize.</w:t>
+      </w:r>
+    </w:p>
+    <w:p>
+      <w:pPr>
+        <w:pStyle w:val="Heading3"/>
+      </w:pPr>
+      <w:r>
+        <w:lastRenderedPageBreak/>
+        <w:t>Transform</w:t>
+      </w:r>
+    </w:p>
+    <w:p>
+      <w:r>
+        <w:t>Allows to rotate,scale and transform mesh through selecting the node, hovering to viewport and then clicking Enter.</w:t>
+      </w:r>
+    </w:p>
+    <w:p>
+      <w:pPr>
+        <w:pStyle w:val="Heading3"/>
+      </w:pPr>
+      <w:r>
+        <w:t>Blast</w:t>
+      </w:r>
+    </w:p>
+    <w:p/>
+    <w:p>
+      <w:pPr>
+        <w:pStyle w:val="Heading3"/>
+      </w:pPr>
+      <w:r>
+        <w:t>UV</w:t>
+      </w:r>
+      <w:r>
+        <w:t>QuickShade</w:t>
+      </w:r>
+    </w:p>
+    <w:p>
+      <w:r>
+        <w:t>Allows for adding textures to the existing mesh.</w:t>
+      </w:r>
+    </w:p>
+    <w:p>
+      <w:pPr>
+        <w:pStyle w:val="Heading3"/>
+      </w:pPr>
+      <w:r>
+        <w:t>Platonic Solids</w:t>
+      </w:r>
+    </w:p>
+    <w:p/>
+    <w:p>
+      <w:pPr>
+        <w:pStyle w:val="Heading3"/>
+      </w:pPr>
+      <w:r>
+        <w:t>Voron</w:t>
+      </w:r>
+      <w:r>
+        <w:t>oi</w:t>
+      </w:r>
+      <w:r>
+        <w:t xml:space="preserve"> Fracture</w:t>
+      </w:r>
+    </w:p>
+    <w:p>
+      <w:r>
+        <w:t>Essentially fractures a mesh and rebuilds the same mesh with different point distribution.</w:t>
+      </w:r>
+    </w:p>
+    <w:p>
+      <w:r>
+        <w:t>Gets a mesh input and points input</w:t>
+      </w:r>
+      <w:r>
+        <w:t>.</w:t>
+      </w:r>
+    </w:p>
     <w:p>
       <w:pPr>
         <w:pStyle w:val="Heading1"/>
       </w:pPr>
       <w:r>
+        <w:lastRenderedPageBreak/>
         <w:t>Gimp</w:t>
       </w:r>
     </w:p>
@@ -495,13 +703,11 @@
         <w:t>.</w:t>
       </w:r>
     </w:p>
-    <w:p/>
     <w:p>
       <w:pPr>
         <w:pStyle w:val="Heading1"/>
       </w:pPr>
       <w:r>
-        <w:lastRenderedPageBreak/>
         <w:t>Blender</w:t>
       </w:r>
     </w:p>
@@ -599,6 +805,7 @@
     </w:p>
     <w:p>
       <w:r>
+        <w:lastRenderedPageBreak/>
         <w:t xml:space="preserve">If you hold the </w:t>
       </w:r>
       <w:r>
@@ -663,7 +870,6 @@
     </w:p>
     <w:p>
       <w:r>
-        <w:lastRenderedPageBreak/>
         <w:t>If while orbiting</w:t>
       </w:r>
       <w:r>
@@ -798,6 +1004,7 @@
         <w:pStyle w:val="Heading4"/>
       </w:pPr>
       <w:r>
+        <w:lastRenderedPageBreak/>
         <w:t>Standard Brush</w:t>
       </w:r>
     </w:p>
@@ -864,6 +1071,7 @@
     </w:p>
     <w:p>
       <w:r>
+        <w:lastRenderedPageBreak/>
         <w:t>Hotkey: Spacebar.</w:t>
       </w:r>
     </w:p>
@@ -874,7 +1082,6 @@
         <w:pStyle w:val="Heading2"/>
       </w:pPr>
       <w:r>
-        <w:lastRenderedPageBreak/>
         <w:t>Dynamic Perspective</w:t>
       </w:r>
     </w:p>
@@ -977,6 +1184,7 @@
         <w:pStyle w:val="Heading2"/>
       </w:pPr>
       <w:r>
+        <w:lastRenderedPageBreak/>
         <w:t>Stroke</w:t>
       </w:r>
     </w:p>
@@ -993,13 +1201,78 @@
         <w:pStyle w:val="Heading3"/>
       </w:pPr>
       <w:r>
+        <w:t xml:space="preserve">Free hand </w:t>
+      </w:r>
+    </w:p>
+    <w:p>
+      <w:r>
+        <w:t>is generally a little smoother.</w:t>
+      </w:r>
+    </w:p>
+    <w:p>
+      <w:pPr>
+        <w:pStyle w:val="Heading3"/>
+      </w:pPr>
+      <w:r>
+        <w:t>Dragrect</w:t>
+      </w:r>
+    </w:p>
+    <w:p>
+      <w:r>
+        <w:t xml:space="preserve">It uses a point to </w:t>
+      </w:r>
+      <w:r>
+        <w:t>add stroke</w:t>
+      </w:r>
+      <w:r>
+        <w:t>.</w:t>
+      </w:r>
+      <w:r>
+        <w:t xml:space="preserve"> You can adjust the size mid operation through moving forward and backward.</w:t>
+      </w:r>
+    </w:p>
+    <w:p>
+      <w:pPr>
+        <w:pStyle w:val="Heading3"/>
+      </w:pPr>
+      <w:r>
+        <w:t>DragDot</w:t>
+      </w:r>
+    </w:p>
+    <w:p>
+      <w:r>
+        <w:t>It’s the previous one without the sizing overhead.</w:t>
+      </w:r>
+    </w:p>
+    <w:p>
+      <w:pPr>
+        <w:pStyle w:val="Heading3"/>
+      </w:pPr>
+      <w:r>
+        <w:t>Color Spray</w:t>
+      </w:r>
+    </w:p>
+    <w:p>
+      <w:r>
+        <w:t>Not sure how to explain it but it adds kinda like randomized piles of the brush</w:t>
+      </w:r>
+      <w:r>
+        <w:t xml:space="preserve"> with color.</w:t>
+      </w:r>
+    </w:p>
+    <w:p/>
+    <w:p>
+      <w:pPr>
+        <w:pStyle w:val="Heading3"/>
+      </w:pPr>
+      <w:r>
         <w:lastRenderedPageBreak/>
-        <w:t xml:space="preserve">Free hand </w:t>
-      </w:r>
-    </w:p>
-    <w:p>
-      <w:r>
-        <w:t>is generally a little smoother.</w:t>
+        <w:t>Spray</w:t>
+      </w:r>
+    </w:p>
+    <w:p>
+      <w:r>
+        <w:t>The same but without color.</w:t>
       </w:r>
     </w:p>
     <w:p>
@@ -1007,89 +1280,70 @@
         <w:pStyle w:val="Heading3"/>
       </w:pPr>
       <w:r>
-        <w:t>Dragrect</w:t>
-      </w:r>
-    </w:p>
-    <w:p>
-      <w:r>
-        <w:t xml:space="preserve">It uses a point to </w:t>
-      </w:r>
-      <w:r>
-        <w:t>add stroke</w:t>
-      </w:r>
-      <w:r>
-        <w:t>.</w:t>
-      </w:r>
-      <w:r>
-        <w:t xml:space="preserve"> You can adjust the size mid operation through moving forward and backward.</w:t>
-      </w:r>
-    </w:p>
-    <w:p>
-      <w:pPr>
-        <w:pStyle w:val="Heading3"/>
-      </w:pPr>
-      <w:r>
-        <w:t>DragDot</w:t>
-      </w:r>
-    </w:p>
-    <w:p>
-      <w:r>
-        <w:t>It’s the previous one without the sizing overhead.</w:t>
-      </w:r>
-    </w:p>
-    <w:p>
-      <w:pPr>
-        <w:pStyle w:val="Heading3"/>
-      </w:pPr>
-      <w:r>
-        <w:t>Color Spray</w:t>
-      </w:r>
-    </w:p>
-    <w:p>
-      <w:r>
-        <w:t>Not sure how to explain it but it adds kinda like randomized piles of the brush</w:t>
-      </w:r>
-      <w:r>
-        <w:t xml:space="preserve"> with color.</w:t>
-      </w:r>
-    </w:p>
-    <w:p/>
-    <w:p>
-      <w:pPr>
-        <w:pStyle w:val="Heading3"/>
-      </w:pPr>
-      <w:r>
-        <w:t>Spray</w:t>
-      </w:r>
-    </w:p>
-    <w:p>
-      <w:r>
-        <w:t>The same but without color.</w:t>
-      </w:r>
-    </w:p>
-    <w:p>
-      <w:pPr>
-        <w:pStyle w:val="Heading3"/>
+        <w:t>Alpha</w:t>
+      </w:r>
+    </w:p>
+    <w:p>
+      <w:r>
+        <w:t>Kinda like the tip pattern of brush.</w:t>
+      </w:r>
+    </w:p>
+    <w:p/>
+    <w:p>
+      <w:pPr>
+        <w:pStyle w:val="Heading2"/>
+      </w:pPr>
+      <w:r>
+        <w:t xml:space="preserve">UI </w:t>
+      </w:r>
+      <w:r>
+        <w:t>Customization</w:t>
+      </w:r>
+    </w:p>
+    <w:p>
+      <w:r>
+        <w:t>Don’t forget to add.</w:t>
+      </w:r>
+    </w:p>
+    <w:p>
+      <w:pPr>
+        <w:pStyle w:val="Heading2"/>
+      </w:pPr>
+      <w:r>
+        <w:t>Dynamesh</w:t>
+      </w:r>
+    </w:p>
+    <w:p>
+      <w:r>
+        <w:t>Recalculates the surface of object to add more geometry where it needs it.</w:t>
+      </w:r>
+    </w:p>
+    <w:p>
+      <w:r>
+        <w:t>Upon every switching on it re adds.</w:t>
+      </w:r>
+    </w:p>
+    <w:p/>
+    <w:p>
+      <w:pPr>
+        <w:pStyle w:val="Heading2"/>
+      </w:pPr>
+      <w:r>
+        <w:t>Mask</w:t>
+      </w:r>
+    </w:p>
+    <w:p>
+      <w:r>
+        <w:t>Is created holding ctrl+dragging outside of mesh.</w:t>
+      </w:r>
+    </w:p>
+    <w:p/>
+    <w:p>
+      <w:pPr>
+        <w:pStyle w:val="Heading1"/>
       </w:pPr>
       <w:r>
         <w:lastRenderedPageBreak/>
-        <w:t>Alpha</w:t>
-      </w:r>
-    </w:p>
-    <w:p>
-      <w:r>
-        <w:t>Kinda like the tip pattern of brush.</w:t>
-      </w:r>
-    </w:p>
-    <w:p/>
-    <w:p/>
-    <w:p/>
-    <w:p/>
-    <w:p>
-      <w:pPr>
-        <w:pStyle w:val="Heading1"/>
-      </w:pPr>
-      <w:r>
         <w:t>Maya</w:t>
       </w:r>
     </w:p>

</xml_diff>